<commit_message>
Reorganiza el codigo de patrones en src/ y elimina archivos duplicados
- Mueve cada patron a src/<patron>/ con su codigo y sus pruebas:
  src/singleton/ y src/factory_method/, cada uno con su conftest.py
- Actualiza pytest.ini (testpaths=src), validar_pruebas.py y los README
- Elimina duplicados y archivos sin uso:
  plataforma.py (orfano), index.html (version antigua sin auth),
  pom.xml (sin codigo Java), Semana 4/factory_method.py (duplicado)
- Limpia "Patron Singleton.md" (quita el volcado de codigo duplicado)
- Ignora .claude/ y archivos temporales de Office en .gitignore

Co-Authored-By: Claude Sonnet 5 <noreply@anthropic.com>
</commit_message>
<xml_diff>
--- a/Semana 4/Factory_Method_IoT.docx
+++ b/Semana 4/Factory_Method_IoT.docx
@@ -1491,6 +1491,147 @@
     </w:p>
     <w:p>
       <w:pPr>
+        <w:spacing w:line="480" w:lineRule="auto"/>
+        <w:rPr>
+          <w:lang w:val="es-CO"/>
+        </w:rPr>
+      </w:pPr>
+    </w:p>
+    <w:p>
+      <w:pPr>
+        <w:spacing w:line="480" w:lineRule="auto"/>
+        <w:rPr>
+          <w:lang w:val="es-CO"/>
+        </w:rPr>
+      </w:pPr>
+      <w:r>
+        <w:rPr>
+          <w:lang w:val="es-CO"/>
+        </w:rPr>
+        <w:lastRenderedPageBreak/>
+        <w:t>Integración con dispositivos IOT</w:t>
+      </w:r>
+    </w:p>
+    <w:p>
+      <w:pPr>
+        <w:spacing w:line="480" w:lineRule="auto"/>
+        <w:rPr>
+          <w:lang w:val="es-CO"/>
+        </w:rPr>
+      </w:pPr>
+      <w:r>
+        <w:rPr>
+          <w:lang w:val="es-CO"/>
+        </w:rPr>
+        <w:drawing>
+          <wp:inline distT="0" distB="0" distL="0" distR="0" wp14:anchorId="560CF51C" wp14:editId="0D9DC837">
+            <wp:extent cx="4459432" cy="2861945"/>
+            <wp:effectExtent l="0" t="0" r="0" b="0"/>
+            <wp:docPr id="549183355" name="Imagen 1"/>
+            <wp:cNvGraphicFramePr>
+              <a:graphicFrameLocks xmlns:a="http://schemas.openxmlformats.org/drawingml/2006/main" noChangeAspect="1"/>
+            </wp:cNvGraphicFramePr>
+            <a:graphic xmlns:a="http://schemas.openxmlformats.org/drawingml/2006/main">
+              <a:graphicData uri="http://schemas.openxmlformats.org/drawingml/2006/picture">
+                <pic:pic xmlns:pic="http://schemas.openxmlformats.org/drawingml/2006/picture">
+                  <pic:nvPicPr>
+                    <pic:cNvPr id="549183355" name=""/>
+                    <pic:cNvPicPr/>
+                  </pic:nvPicPr>
+                  <pic:blipFill>
+                    <a:blip r:embed="rId7"/>
+                    <a:stretch>
+                      <a:fillRect/>
+                    </a:stretch>
+                  </pic:blipFill>
+                  <pic:spPr>
+                    <a:xfrm>
+                      <a:off x="0" y="0"/>
+                      <a:ext cx="4468052" cy="2867477"/>
+                    </a:xfrm>
+                    <a:prstGeom prst="rect">
+                      <a:avLst/>
+                    </a:prstGeom>
+                  </pic:spPr>
+                </pic:pic>
+              </a:graphicData>
+            </a:graphic>
+          </wp:inline>
+        </w:drawing>
+      </w:r>
+    </w:p>
+    <w:p>
+      <w:pPr>
+        <w:spacing w:line="480" w:lineRule="auto"/>
+        <w:rPr>
+          <w:lang w:val="es-CO"/>
+        </w:rPr>
+      </w:pPr>
+      <w:r>
+        <w:rPr>
+          <w:lang w:val="es-CO"/>
+        </w:rPr>
+        <w:t xml:space="preserve">Plataforma de comercio </w:t>
+      </w:r>
+    </w:p>
+    <w:p>
+      <w:pPr>
+        <w:spacing w:line="480" w:lineRule="auto"/>
+        <w:rPr>
+          <w:lang w:val="es-CO"/>
+        </w:rPr>
+      </w:pPr>
+      <w:r>
+        <w:rPr>
+          <w:lang w:val="es-CO"/>
+        </w:rPr>
+        <w:drawing>
+          <wp:inline distT="0" distB="0" distL="0" distR="0" wp14:anchorId="458E8480" wp14:editId="7FD7E657">
+            <wp:extent cx="4411980" cy="3000712"/>
+            <wp:effectExtent l="0" t="0" r="7620" b="9525"/>
+            <wp:docPr id="1771457742" name="Imagen 1"/>
+            <wp:cNvGraphicFramePr>
+              <a:graphicFrameLocks xmlns:a="http://schemas.openxmlformats.org/drawingml/2006/main" noChangeAspect="1"/>
+            </wp:cNvGraphicFramePr>
+            <a:graphic xmlns:a="http://schemas.openxmlformats.org/drawingml/2006/main">
+              <a:graphicData uri="http://schemas.openxmlformats.org/drawingml/2006/picture">
+                <pic:pic xmlns:pic="http://schemas.openxmlformats.org/drawingml/2006/picture">
+                  <pic:nvPicPr>
+                    <pic:cNvPr id="1771457742" name=""/>
+                    <pic:cNvPicPr/>
+                  </pic:nvPicPr>
+                  <pic:blipFill>
+                    <a:blip r:embed="rId8"/>
+                    <a:stretch>
+                      <a:fillRect/>
+                    </a:stretch>
+                  </pic:blipFill>
+                  <pic:spPr>
+                    <a:xfrm>
+                      <a:off x="0" y="0"/>
+                      <a:ext cx="4416613" cy="3003863"/>
+                    </a:xfrm>
+                    <a:prstGeom prst="rect">
+                      <a:avLst/>
+                    </a:prstGeom>
+                  </pic:spPr>
+                </pic:pic>
+              </a:graphicData>
+            </a:graphic>
+          </wp:inline>
+        </w:drawing>
+      </w:r>
+    </w:p>
+    <w:p>
+      <w:pPr>
+        <w:spacing w:line="480" w:lineRule="auto"/>
+        <w:rPr>
+          <w:lang w:val="es-CO"/>
+        </w:rPr>
+      </w:pPr>
+    </w:p>
+    <w:p>
+      <w:pPr>
         <w:pStyle w:val="Prrafodelista"/>
         <w:numPr>
           <w:ilvl w:val="0"/>
@@ -1504,7 +1645,7 @@
         </w:rPr>
         <w:t xml:space="preserve">Link video Teams </w:t>
       </w:r>
-      <w:hyperlink r:id="rId7" w:history="1">
+      <w:hyperlink r:id="rId9" w:history="1">
         <w:r>
           <w:rPr>
             <w:rStyle w:val="Hipervnculo"/>
@@ -1528,7 +1669,6 @@
           <w:sz w:val="24"/>
           <w:szCs w:val="24"/>
         </w:rPr>
-        <w:lastRenderedPageBreak/>
         <w:t>Conclusión</w:t>
       </w:r>
       <w:proofErr w:type="spellEnd"/>
@@ -1546,6 +1686,7 @@
           <w:color w:val="000000"/>
           <w:lang w:val="es-CO"/>
         </w:rPr>
+        <w:lastRenderedPageBreak/>
         <w:t xml:space="preserve">En resumen, el patrón Singleton garantiza que toda la plataforma comparta el mismo estado, mientras que el Factory Method garantiza que cada tipo de dispositivo </w:t>
       </w:r>
       <w:proofErr w:type="spellStart"/>
@@ -1682,7 +1823,7 @@
       </w:r>
     </w:p>
     <w:sectPr>
-      <w:headerReference w:type="default" r:id="rId8"/>
+      <w:headerReference w:type="default" r:id="rId10"/>
       <w:pgSz w:w="12240" w:h="15840"/>
       <w:pgMar w:top="1440" w:right="1440" w:bottom="1440" w:left="1440" w:header="708" w:footer="708" w:gutter="0"/>
       <w:cols w:space="720"/>
@@ -2413,6 +2554,7 @@
   <w:style w:type="character" w:default="1" w:styleId="Fuentedeprrafopredeter">
     <w:name w:val="Default Paragraph Font"/>
     <w:uiPriority w:val="1"/>
+    <w:semiHidden/>
     <w:unhideWhenUsed/>
   </w:style>
   <w:style w:type="table" w:default="1" w:styleId="Tablanormal">

</xml_diff>